<commit_message>
Part 1 final version
</commit_message>
<xml_diff>
--- a/Prime Fade Studio - Content Research/Sources.docx.docx
+++ b/Prime Fade Studio - Content Research/Sources.docx.docx
@@ -1,6 +1,6 @@
 
 <file path=word/document.xml><?xml version="1.0" encoding="utf-8"?>
-<w:document xmlns:wpc="http://schemas.microsoft.com/office/word/2010/wordprocessingCanvas" xmlns:cx="http://schemas.microsoft.com/office/drawing/2014/chartex" xmlns:cx1="http://schemas.microsoft.com/office/drawing/2015/9/8/chartex" xmlns:cx2="http://schemas.microsoft.com/office/drawing/2015/10/21/chartex" xmlns:cx3="http://schemas.microsoft.com/office/drawing/2016/5/9/chartex" xmlns:cx4="http://schemas.microsoft.com/office/drawing/2016/5/10/chartex" xmlns:cx5="http://schemas.microsoft.com/office/drawing/2016/5/11/chartex" xmlns:cx6="http://schemas.microsoft.com/office/drawing/2016/5/12/chartex" xmlns:cx7="http://schemas.microsoft.com/office/drawing/2016/5/13/chartex" xmlns:cx8="http://schemas.microsoft.com/office/drawing/2016/5/14/chartex" xmlns:mc="http://schemas.openxmlformats.org/markup-compatibility/2006" xmlns:aink="http://schemas.microsoft.com/office/drawing/2016/ink" xmlns:am3d="http://schemas.microsoft.com/office/drawing/2017/model3d" xmlns:o="urn:schemas-microsoft-com:office:office" xmlns:oel="http://schemas.microsoft.com/office/2019/extlst" xmlns:r="http://schemas.openxmlformats.org/officeDocument/2006/relationships" xmlns:m="http://schemas.openxmlformats.org/officeDocument/2006/math" xmlns:v="urn:schemas-microsoft-com:vml" xmlns:wp14="http://schemas.microsoft.com/office/word/2010/wordprocessingDrawing" xmlns:wp="http://schemas.openxmlformats.org/drawingml/2006/wordprocessingDrawing" xmlns:w10="urn:schemas-microsoft-com:office:word" xmlns:w="http://schemas.openxmlformats.org/wordprocessingml/2006/main" xmlns:w14="http://schemas.microsoft.com/office/word/2010/wordml" xmlns:w15="http://schemas.microsoft.com/office/word/2012/wordml" xmlns:w16cei="http://schemas.microsoft.com/office/word/2026/wordml/cei" xmlns:w16cex="http://schemas.microsoft.com/office/word/2018/wordml/cex" xmlns:w16cid="http://schemas.microsoft.com/office/word/2016/wordml/cid" xmlns:w16="http://schemas.microsoft.com/office/word/2018/wordml" xmlns:w16du="http://schemas.microsoft.com/office/word/2023/wordml/word16du" xmlns:w16sdtdh="http://schemas.microsoft.com/office/word/2020/wordml/sdtdatahash" xmlns:w16sdtfl="http://schemas.microsoft.com/office/word/2024/wordml/sdtformatlock" xmlns:w16se="http://schemas.microsoft.com/office/word/2015/wordml/symex" xmlns:wpg="http://schemas.microsoft.com/office/word/2010/wordprocessingGroup" xmlns:wpi="http://schemas.microsoft.com/office/word/2010/wordprocessingInk" xmlns:wne="http://schemas.microsoft.com/office/word/2006/wordml" xmlns:wps="http://schemas.microsoft.com/office/word/2010/wordprocessingShape" mc:Ignorable="w14 w15 w16se w16cid w16 w16cex w16sdtdh w16sdtfl w16du wp14">
+<w:document xmlns:wpc="http://schemas.microsoft.com/office/word/2010/wordprocessingCanvas" xmlns:cx="http://schemas.microsoft.com/office/drawing/2014/chartex" xmlns:cx1="http://schemas.microsoft.com/office/drawing/2015/9/8/chartex" xmlns:cx2="http://schemas.microsoft.com/office/drawing/2015/10/21/chartex" xmlns:cx3="http://schemas.microsoft.com/office/drawing/2016/5/9/chartex" xmlns:cx4="http://schemas.microsoft.com/office/drawing/2016/5/10/chartex" xmlns:cx5="http://schemas.microsoft.com/office/drawing/2016/5/11/chartex" xmlns:cx6="http://schemas.microsoft.com/office/drawing/2016/5/12/chartex" xmlns:cx7="http://schemas.microsoft.com/office/drawing/2016/5/13/chartex" xmlns:cx8="http://schemas.microsoft.com/office/drawing/2016/5/14/chartex" xmlns:mc="http://schemas.openxmlformats.org/markup-compatibility/2006" xmlns:aink="http://schemas.microsoft.com/office/drawing/2016/ink" xmlns:am3d="http://schemas.microsoft.com/office/drawing/2017/model3d" xmlns:o="urn:schemas-microsoft-com:office:office" xmlns:oel="http://schemas.microsoft.com/office/2019/extlst" xmlns:r="http://schemas.openxmlformats.org/officeDocument/2006/relationships" xmlns:m="http://schemas.openxmlformats.org/officeDocument/2006/math" xmlns:v="urn:schemas-microsoft-com:vml" xmlns:wp14="http://schemas.microsoft.com/office/word/2010/wordprocessingDrawing" xmlns:wp="http://schemas.openxmlformats.org/drawingml/2006/wordprocessingDrawing" xmlns:w10="urn:schemas-microsoft-com:office:word" xmlns:w="http://schemas.openxmlformats.org/wordprocessingml/2006/main" xmlns:w14="http://schemas.microsoft.com/office/word/2010/wordml" xmlns:w15="http://schemas.microsoft.com/office/word/2012/wordml" xmlns:w16cex="http://schemas.microsoft.com/office/word/2018/wordml/cex" xmlns:w16cid="http://schemas.microsoft.com/office/word/2016/wordml/cid" xmlns:w16="http://schemas.microsoft.com/office/word/2018/wordml" xmlns:w16du="http://schemas.microsoft.com/office/word/2023/wordml/word16du" xmlns:w16sdtdh="http://schemas.microsoft.com/office/word/2020/wordml/sdtdatahash" xmlns:w16sdtfl="http://schemas.microsoft.com/office/word/2024/wordml/sdtformatlock" xmlns:w16se="http://schemas.microsoft.com/office/word/2015/wordml/symex" xmlns:wpg="http://schemas.microsoft.com/office/word/2010/wordprocessingGroup" xmlns:wpi="http://schemas.microsoft.com/office/word/2010/wordprocessingInk" xmlns:wne="http://schemas.microsoft.com/office/word/2006/wordml" xmlns:wps="http://schemas.microsoft.com/office/word/2010/wordprocessingShape" mc:Ignorable="w14 w15 w16se w16cid w16 w16cex w16sdtdh w16sdtfl w16du wp14">
   <w:body>
     <w:p>
       <w:r>
@@ -11,13 +11,8 @@
       <w:pPr>
         <w:spacing w:after="0" w:line="240" w:lineRule="auto"/>
       </w:pPr>
-      <w:proofErr w:type="spellStart"/>
-      <w:r>
-        <w:t>Dribbble</w:t>
-      </w:r>
-      <w:proofErr w:type="spellEnd"/>
-      <w:r>
-        <w:t xml:space="preserve"> (n.d.) Web Design Inspiration. Available at: </w:t>
+      <w:r>
+        <w:t xml:space="preserve">Dribbble (n.d.) Web Design Inspiration. Available at: </w:t>
       </w:r>
       <w:r>
         <w:t xml:space="preserve"> </w:t>
@@ -103,13 +98,8 @@
     </w:p>
     <w:p/>
     <w:p>
-      <w:proofErr w:type="spellStart"/>
-      <w:r>
-        <w:t>Vecteezy</w:t>
-      </w:r>
-      <w:proofErr w:type="spellEnd"/>
-      <w:r>
-        <w:t>(n.d.) African Barber photos and images. Available at: </w:t>
+      <w:r>
+        <w:t>Vecteezy(n.d.) African Barber photos and images. Available at: </w:t>
       </w:r>
     </w:p>
     <w:p>
@@ -195,13 +185,8 @@
     </w:p>
     <w:p/>
     <w:p>
-      <w:proofErr w:type="spellStart"/>
-      <w:r>
-        <w:t>Gettyimages</w:t>
-      </w:r>
-      <w:proofErr w:type="spellEnd"/>
-      <w:r>
-        <w:t>(n.d.) Barber Shop Africa Stock videos and Footage. Available at: </w:t>
+      <w:r>
+        <w:t>Gettyimages(n.d.) Barber Shop Africa Stock videos and Footage. Available at: </w:t>
       </w:r>
     </w:p>
     <w:p>
@@ -235,13 +220,20 @@
       <w:r>
         <w:t xml:space="preserve"> </w:t>
       </w:r>
-      <w:r>
-        <w:t>https://www.magnific.com/premium-vector/barber-shop-vintage-logo-design_14057505.htm </w:t>
-      </w:r>
-    </w:p>
-    <w:p>
-      <w:r>
-        <w:lastRenderedPageBreak/>
+      <w:hyperlink r:id="rId11" w:history="1">
+        <w:r>
+          <w:rPr>
+            <w:rStyle w:val="Hyperlink"/>
+          </w:rPr>
+          <w:t>https://www.magnific.com/premium-vector/barber-shop-vintage-logo-design_14057505.htm</w:t>
+        </w:r>
+      </w:hyperlink>
+      <w:r>
+        <w:t xml:space="preserve"> </w:t>
+      </w:r>
+    </w:p>
+    <w:p>
+      <w:r>
         <w:t>(Accessed 12 August 2026)</w:t>
       </w:r>
     </w:p>
@@ -1575,4 +1567,10 @@
     </a:ext>
   </a:extLst>
 </a:theme>
+</file>
+
+<file path=docMetadata/LabelInfo.xml><?xml version="1.0" encoding="utf-8"?>
+<clbl:labelList xmlns:clbl="http://schemas.microsoft.com/office/2020/mipLabelMetadata">
+  <clbl:label id="{e10c8f44-f469-448f-bc0d-d781288ff01b}" enabled="0" method="" siteId="{e10c8f44-f469-448f-bc0d-d781288ff01b}" removed="1"/>
+</clbl:labelList>
 </file>
</xml_diff>

<commit_message>
Complete Part 2 CSS and responsive design
</commit_message>
<xml_diff>
--- a/Prime Fade Studio - Content Research/Sources.docx.docx
+++ b/Prime Fade Studio - Content Research/Sources.docx.docx
@@ -1,6 +1,6 @@
 
 <file path=word/document.xml><?xml version="1.0" encoding="utf-8"?>
-<w:document xmlns:wpc="http://schemas.microsoft.com/office/word/2010/wordprocessingCanvas" xmlns:cx="http://schemas.microsoft.com/office/drawing/2014/chartex" xmlns:cx1="http://schemas.microsoft.com/office/drawing/2015/9/8/chartex" xmlns:cx2="http://schemas.microsoft.com/office/drawing/2015/10/21/chartex" xmlns:cx3="http://schemas.microsoft.com/office/drawing/2016/5/9/chartex" xmlns:cx4="http://schemas.microsoft.com/office/drawing/2016/5/10/chartex" xmlns:cx5="http://schemas.microsoft.com/office/drawing/2016/5/11/chartex" xmlns:cx6="http://schemas.microsoft.com/office/drawing/2016/5/12/chartex" xmlns:cx7="http://schemas.microsoft.com/office/drawing/2016/5/13/chartex" xmlns:cx8="http://schemas.microsoft.com/office/drawing/2016/5/14/chartex" xmlns:mc="http://schemas.openxmlformats.org/markup-compatibility/2006" xmlns:aink="http://schemas.microsoft.com/office/drawing/2016/ink" xmlns:am3d="http://schemas.microsoft.com/office/drawing/2017/model3d" xmlns:o="urn:schemas-microsoft-com:office:office" xmlns:oel="http://schemas.microsoft.com/office/2019/extlst" xmlns:r="http://schemas.openxmlformats.org/officeDocument/2006/relationships" xmlns:m="http://schemas.openxmlformats.org/officeDocument/2006/math" xmlns:v="urn:schemas-microsoft-com:vml" xmlns:wp14="http://schemas.microsoft.com/office/word/2010/wordprocessingDrawing" xmlns:wp="http://schemas.openxmlformats.org/drawingml/2006/wordprocessingDrawing" xmlns:w10="urn:schemas-microsoft-com:office:word" xmlns:w="http://schemas.openxmlformats.org/wordprocessingml/2006/main" xmlns:w14="http://schemas.microsoft.com/office/word/2010/wordml" xmlns:w15="http://schemas.microsoft.com/office/word/2012/wordml" xmlns:w16cei="http://schemas.microsoft.com/office/word/2026/wordml/cei" xmlns:w16cex="http://schemas.microsoft.com/office/word/2018/wordml/cex" xmlns:w16cid="http://schemas.microsoft.com/office/word/2016/wordml/cid" xmlns:w16="http://schemas.microsoft.com/office/word/2018/wordml" xmlns:w16du="http://schemas.microsoft.com/office/word/2023/wordml/word16du" xmlns:w16sdtdh="http://schemas.microsoft.com/office/word/2020/wordml/sdtdatahash" xmlns:w16sdtfl="http://schemas.microsoft.com/office/word/2024/wordml/sdtformatlock" xmlns:w16se="http://schemas.microsoft.com/office/word/2015/wordml/symex" xmlns:wpg="http://schemas.microsoft.com/office/word/2010/wordprocessingGroup" xmlns:wpi="http://schemas.microsoft.com/office/word/2010/wordprocessingInk" xmlns:wne="http://schemas.microsoft.com/office/word/2006/wordml" xmlns:wps="http://schemas.microsoft.com/office/word/2010/wordprocessingShape" mc:Ignorable="w14 w15 w16se w16cid w16 w16cex w16sdtdh w16sdtfl w16du wp14">
+<w:document xmlns:wpc="http://schemas.microsoft.com/office/word/2010/wordprocessingCanvas" xmlns:cx="http://schemas.microsoft.com/office/drawing/2014/chartex" xmlns:cx1="http://schemas.microsoft.com/office/drawing/2015/9/8/chartex" xmlns:cx2="http://schemas.microsoft.com/office/drawing/2015/10/21/chartex" xmlns:cx3="http://schemas.microsoft.com/office/drawing/2016/5/9/chartex" xmlns:cx4="http://schemas.microsoft.com/office/drawing/2016/5/10/chartex" xmlns:cx5="http://schemas.microsoft.com/office/drawing/2016/5/11/chartex" xmlns:cx6="http://schemas.microsoft.com/office/drawing/2016/5/12/chartex" xmlns:cx7="http://schemas.microsoft.com/office/drawing/2016/5/13/chartex" xmlns:cx8="http://schemas.microsoft.com/office/drawing/2016/5/14/chartex" xmlns:mc="http://schemas.openxmlformats.org/markup-compatibility/2006" xmlns:aink="http://schemas.microsoft.com/office/drawing/2016/ink" xmlns:am3d="http://schemas.microsoft.com/office/drawing/2017/model3d" xmlns:o="urn:schemas-microsoft-com:office:office" xmlns:oel="http://schemas.microsoft.com/office/2019/extlst" xmlns:r="http://schemas.openxmlformats.org/officeDocument/2006/relationships" xmlns:m="http://schemas.openxmlformats.org/officeDocument/2006/math" xmlns:v="urn:schemas-microsoft-com:vml" xmlns:wp14="http://schemas.microsoft.com/office/word/2010/wordprocessingDrawing" xmlns:wp="http://schemas.openxmlformats.org/drawingml/2006/wordprocessingDrawing" xmlns:w10="urn:schemas-microsoft-com:office:word" xmlns:w="http://schemas.openxmlformats.org/wordprocessingml/2006/main" xmlns:w14="http://schemas.microsoft.com/office/word/2010/wordml" xmlns:w15="http://schemas.microsoft.com/office/word/2012/wordml" xmlns:w16cex="http://schemas.microsoft.com/office/word/2018/wordml/cex" xmlns:w16cid="http://schemas.microsoft.com/office/word/2016/wordml/cid" xmlns:w16="http://schemas.microsoft.com/office/word/2018/wordml" xmlns:w16du="http://schemas.microsoft.com/office/word/2023/wordml/word16du" xmlns:w16sdtdh="http://schemas.microsoft.com/office/word/2020/wordml/sdtdatahash" xmlns:w16sdtfl="http://schemas.microsoft.com/office/word/2024/wordml/sdtformatlock" xmlns:w16se="http://schemas.microsoft.com/office/word/2015/wordml/symex" xmlns:wpg="http://schemas.microsoft.com/office/word/2010/wordprocessingGroup" xmlns:wpi="http://schemas.microsoft.com/office/word/2010/wordprocessingInk" xmlns:wne="http://schemas.microsoft.com/office/word/2006/wordml" xmlns:wps="http://schemas.microsoft.com/office/word/2010/wordprocessingShape" mc:Ignorable="w14 w15 w16se w16cid w16 w16cex w16sdtdh w16sdtfl w16du wp14">
   <w:body>
     <w:p>
       <w:r>
@@ -11,13 +11,8 @@
       <w:pPr>
         <w:spacing w:after="0" w:line="240" w:lineRule="auto"/>
       </w:pPr>
-      <w:proofErr w:type="spellStart"/>
-      <w:r>
-        <w:t>Dribbble</w:t>
-      </w:r>
-      <w:proofErr w:type="spellEnd"/>
-      <w:r>
-        <w:t xml:space="preserve"> (n.d.) Web Design Inspiration. Available at: </w:t>
+      <w:r>
+        <w:t xml:space="preserve">Dribbble (n.d.) Web Design Inspiration. Available at: </w:t>
       </w:r>
       <w:r>
         <w:t xml:space="preserve"> </w:t>
@@ -103,13 +98,8 @@
     </w:p>
     <w:p/>
     <w:p>
-      <w:proofErr w:type="spellStart"/>
-      <w:r>
-        <w:t>Vecteezy</w:t>
-      </w:r>
-      <w:proofErr w:type="spellEnd"/>
-      <w:r>
-        <w:t>(n.d.) African Barber photos and images. Available at: </w:t>
+      <w:r>
+        <w:t>Vecteezy(n.d.) African Barber photos and images. Available at: </w:t>
       </w:r>
     </w:p>
     <w:p>
@@ -195,13 +185,8 @@
     </w:p>
     <w:p/>
     <w:p>
-      <w:proofErr w:type="spellStart"/>
-      <w:r>
-        <w:t>Gettyimages</w:t>
-      </w:r>
-      <w:proofErr w:type="spellEnd"/>
-      <w:r>
-        <w:t>(n.d.) Barber Shop Africa Stock videos and Footage. Available at: </w:t>
+      <w:r>
+        <w:t>Gettyimages(n.d.) Barber Shop Africa Stock videos and Footage. Available at: </w:t>
       </w:r>
     </w:p>
     <w:p>
@@ -235,13 +220,20 @@
       <w:r>
         <w:t xml:space="preserve"> </w:t>
       </w:r>
-      <w:r>
-        <w:t>https://www.magnific.com/premium-vector/barber-shop-vintage-logo-design_14057505.htm </w:t>
-      </w:r>
-    </w:p>
-    <w:p>
-      <w:r>
-        <w:lastRenderedPageBreak/>
+      <w:hyperlink r:id="rId11" w:history="1">
+        <w:r>
+          <w:rPr>
+            <w:rStyle w:val="Hyperlink"/>
+          </w:rPr>
+          <w:t>https://www.magnific.com/premium-vector/barber-shop-vintage-logo-design_14057505.htm</w:t>
+        </w:r>
+      </w:hyperlink>
+      <w:r>
+        <w:t xml:space="preserve"> </w:t>
+      </w:r>
+    </w:p>
+    <w:p>
+      <w:r>
         <w:t>(Accessed 12 August 2026)</w:t>
       </w:r>
     </w:p>
@@ -1575,4 +1567,10 @@
     </a:ext>
   </a:extLst>
 </a:theme>
+</file>
+
+<file path=docMetadata/LabelInfo.xml><?xml version="1.0" encoding="utf-8"?>
+<clbl:labelList xmlns:clbl="http://schemas.microsoft.com/office/2020/mipLabelMetadata">
+  <clbl:label id="{e10c8f44-f469-448f-bc0d-d781288ff01b}" enabled="0" method="" siteId="{e10c8f44-f469-448f-bc0d-d781288ff01b}" removed="1"/>
+</clbl:labelList>
 </file>
</xml_diff>